<commit_message>
Use workpaper name BSI.IT.6.C7.3_E00_Workpaper_DR_DIV_INTEGRATED_APPLICATION.xlsx in manual and repo
Co-Authored-By: Claude Opus 5.5 <noreply@anthropic.com>
Claude-Session: https://claude.ai/code/session_01TL6bHHvGD5mcHDaTAY6zMH
</commit_message>
<xml_diff>
--- a/BSI_Extraction_Instructions_BSI.IT.6.C7.3-Evidences.7z.docx
+++ b/BSI_Extraction_Instructions_BSI.IT.6.C7.3-Evidences.7z.docx
@@ -149,7 +149,7 @@
                 <w:b/>
                 <w:bCs/>
               </w:rPr>
-              <w:t xml:space="preserve">BSI.IT.6.C7.3_E00_Workpaper_DR_DIV_INTEGRATED_APPLICATION_13_1.xlsx</w:t>
+              <w:t xml:space="preserve">BSI.IT.6.C7.3_E00_Workpaper_DR_DIV_INTEGRATED_APPLICATION.xlsx</w:t>
             </w:r>
           </w:p>
         </w:tc>
@@ -456,7 +456,7 @@
                 <w:sz w:val="18"/>
                 <w:szCs w:val="18"/>
               </w:rPr>
-              <w:t xml:space="preserve">├── BSI.IT.6.C7.3_E00_Workpaper_DR_DIV_INTEGRATED_APPLICATION_13_1.xlsx</w:t>
+              <w:t xml:space="preserve">├── BSI.IT.6.C7.3_E00_Workpaper_DR_DIV_INTEGRATED_APPLICATION.xlsx</w:t>
             </w:r>
           </w:p>
           <w:p>
@@ -578,7 +578,7 @@
           <w:b/>
           <w:bCs/>
         </w:rPr>
-        <w:t xml:space="preserve">BSI.IT.6.C7.3_E00_Workpaper_DR_DIV_INTEGRATED_APPLICATION_13_1.xlsx</w:t>
+        <w:t xml:space="preserve">BSI.IT.6.C7.3_E00_Workpaper_DR_DIV_INTEGRATED_APPLICATION.xlsx</w:t>
       </w:r>
       <w:r>
         <w:t xml:space="preserve"> and </w:t>
@@ -1211,7 +1211,7 @@
           <w:b/>
           <w:bCs/>
         </w:rPr>
-        <w:t xml:space="preserve">BSI.IT.6.C7.3_E00_Workpaper_DR_DIV_INTEGRATED_APPLICATION_13_1.xlsx</w:t>
+        <w:t xml:space="preserve">BSI.IT.6.C7.3_E00_Workpaper_DR_DIV_INTEGRATED_APPLICATION.xlsx</w:t>
       </w:r>
       <w:r>
         <w:t xml:space="preserve">. Open it from Downloads, not from the email or the browser download bar.</w:t>

</xml_diff>